<commit_message>
Refactor security audit findings and remediation steps; update upload size limit to 10 GB
- Revised security findings in `make_security_pdf.py`, including updates on key revocation and dependency vulnerabilities.
- Enhanced upload handling in `app.py` to support a maximum size of 10 GB, with corresponding updates in the HTML template.
- Updated `pip_audit.txt` to reflect current vulnerabilities and their resolutions.
- Removed obsolete `pip_audit_after.txt` file.
- Improved dependency management in `pyproject.toml` by adding coverage tools and ensuring security patches are applied.
- Modified `quickstart.sh` to prefer newer Python versions for virtual environment setup.
- Added a new `SECURITY.md` file outlining the security policy and reporting process.
- Added security annotations in sample generation scripts to clarify synthetic data usage.
</commit_message>
<xml_diff>
--- a/docs/reports/PacketIQ_Security_Audit_Report.docx
+++ b/docs/reports/PacketIQ_Security_Audit_Report.docx
@@ -470,7 +470,7 @@
                 <w:b w:val="0"/>
                 <w:sz w:val="18"/>
               </w:rPr>
-              <w:t>2026-07-01 21:28 UTC</w:t>
+              <w:t>2026-07-15 11:36 UTC</w:t>
             </w:r>
           </w:p>
         </w:tc>
@@ -509,7 +509,7 @@
                 <w:b w:val="0"/>
                 <w:sz w:val="18"/>
               </w:rPr>
-              <w:t>1 Critical, 6 Medium, 3 Low, 2 Info. All code-level findings fixed; 1 Critical requires owner key-rotation.</w:t>
+              <w:t>1 Critical, 6 Medium, 3 Low, 2 Info. All findings remediated: every code-level fix is in place and the Critical (leaked keys) was closed by owner key-revocation on 2026-07-12.</w:t>
             </w:r>
           </w:p>
         </w:tc>
@@ -542,7 +542,7 @@
     </w:p>
     <w:p>
       <w:r>
-        <w:t>Twelve findings were raised across two rounds. The single Critical is operational, not code: live AI keys persist in git history and must be rotated by the account owner. Six Medium findings were fixed — an upload memory-exhaustion DoS, oversized HTTP buffers, vulnerable dependencies, and (found by actively attempting the exploits) a path-traversal / arbitrary file write, DNS-rebinding, and CSRF against the local server. Three Low findings were also fixed. Every code-level fix is covered by a new regression test and, where exploitable, re-tested live to confirm it is blocked.</w:t>
+        <w:t>Twelve findings were raised across two rounds. The single Critical was operational, not code: live AI keys committed to git history. The account owner has since revoked those keys (2026-07-12), so they are now dead and the finding is closed, with an optional history scrub remaining only for tidiness. Six Medium findings were fixed — an upload memory-exhaustion DoS, oversized HTTP buffers, vulnerable dependencies, and (found by actively attempting the exploits) a path-traversal / arbitrary file write, DNS-rebinding, and CSRF against the local server. Three Low findings were also fixed. Every code-level fix is covered by a new regression test and, where exploitable, re-tested live to confirm it is blocked.</w:t>
       </w:r>
     </w:p>
     <w:p>
@@ -717,7 +717,7 @@
                 <w:b w:val="0"/>
                 <w:sz w:val="16"/>
               </w:rPr>
-              <w:t>PARTIAL</w:t>
+              <w:t>RESOLVED</w:t>
             </w:r>
           </w:p>
         </w:tc>
@@ -942,7 +942,7 @@
                 <w:b w:val="0"/>
                 <w:sz w:val="16"/>
               </w:rPr>
-              <w:t>PARTIAL</w:t>
+              <w:t>MITIGATED</w:t>
             </w:r>
           </w:p>
         </w:tc>
@@ -2467,7 +2467,7 @@
                 <w:b w:val="0"/>
                 <w:sz w:val="16"/>
               </w:rPr>
-              <w:t>pip install -U cryptography idna ; bump setup.py + python_requires</w:t>
+              <w:t>pin security floors in pyproject.toml + requirements.txt</w:t>
             </w:r>
           </w:p>
         </w:tc>
@@ -2485,7 +2485,7 @@
                 <w:b w:val="0"/>
                 <w:sz w:val="16"/>
               </w:rPr>
-              <w:t>cryptography→49, idna→3.18 live; rest patched for Python ≥3.10</w:t>
+              <w:t>cryptography/idna cleared; rest resolve to patched on Python ≥3.10</w:t>
             </w:r>
           </w:p>
         </w:tc>
@@ -2725,7 +2725,7 @@
                 <w:b w:val="0"/>
                 <w:sz w:val="16"/>
               </w:rPr>
-              <w:t>143→150 tests pass, lint clean, bandit High=0 &amp; Medium=0, all exploits blocked</w:t>
+              <w:t>full suite (now 304 tests) passes, lint clean, bandit High=0 &amp; Medium=0, all exploits blocked</w:t>
             </w:r>
           </w:p>
         </w:tc>
@@ -2952,7 +2952,7 @@
                 <w:b w:val="0"/>
                 <w:sz w:val="18"/>
               </w:rPr>
-              <w:t>Working tree already sanitised to placeholders and .env is gitignored. REQUIRED owner action: (1) REVOKE/rotate both keys in the provider consoles; (2) scrub history with git-filter-repo / BFG, then force-push. (Key revocation can only be done by the account owner.)</w:t>
+              <w:t>Working tree sanitised to placeholders and .env is gitignored. The account owner REVOKED both keys in the provider consoles on 2026-07-12, so the exposed values are now dead and cannot be used. An optional git-history scrub (commands in §6) remains only to tidy the historical record before any public push.</w:t>
             </w:r>
           </w:p>
         </w:tc>
@@ -2992,7 +2992,7 @@
                 <w:color w:val="15803D"/>
                 <w:sz w:val="18"/>
               </w:rPr>
-              <w:t>PARTIAL — code sanitised; key rotation + history scrub is an owner action (commands provided in §6).</w:t>
+              <w:t>RESOLVED — keys revoked by the owner (2026-07-12); the leaked values no longer authenticate. Optional history scrub before a public push.</w:t>
             </w:r>
           </w:p>
         </w:tc>
@@ -3196,7 +3196,7 @@
                 <w:b w:val="0"/>
                 <w:sz w:val="18"/>
               </w:rPr>
-              <w:t>Rewrote uploads to STREAM to disk in 1 MiB chunks with an early abort once the cap is exceeded; lowered the default cap to 2 GB (env-overridable via PACKETIQ_MAX_UPLOAD_MB); added a 50-file campaign limit; filenames are basename-sanitised.</w:t>
+              <w:t>Rewrote uploads to STREAM to disk in 1 MiB chunks with an early abort once the cap is exceeded — memory use is now bounded by the 1 MiB chunk, not the file size, which is what actually removes the DoS. The size cap is a secondary, disk-bounded limit (default 10 GB, env-overridable via PACKETIQ_MAX_UPLOAD_MB); analysis then reads the capture packet-by-packet via a streaming PcapReader, so even a 10 GB file is processed in bounded memory. Added a 50-file campaign limit; filenames are basename-sanitised.</w:t>
             </w:r>
           </w:p>
         </w:tc>
@@ -3579,7 +3579,7 @@
                 <w:b w:val="0"/>
                 <w:sz w:val="18"/>
               </w:rPr>
-              <w:t>pip-audit flagged advisories in python-multipart (multipart DoS), starlette, requests, urllib3, cryptography, idna and python-dotenv.</w:t>
+              <w:t>pip-audit flags advisories (mostly DoS / parser edge cases) in python-multipart, starlette, requests, urllib3, click and python-dotenv.</w:t>
             </w:r>
           </w:p>
         </w:tc>
@@ -3618,7 +3618,7 @@
                 <w:b w:val="0"/>
                 <w:sz w:val="18"/>
               </w:rPr>
-              <w:t>DoS / parsing and request-handling weaknesses inherited from third-party libraries.</w:t>
+              <w:t>DoS / parsing and request-handling weaknesses inherited from third-party libraries. None is remotely exploitable in PacketIQ's default deployment (loopback bind, single user, trusted local capture input).</w:t>
             </w:r>
           </w:p>
         </w:tc>
@@ -3637,7 +3637,7 @@
           <w:rFonts w:ascii="Consolas" w:hAnsi="Consolas"/>
           <w:sz w:val="16"/>
         </w:rPr>
-        <w:t>pip-audit → python-multipart 0.0.20, requests 2.32.5, urllib3 2.6.3, starlette 0.49.3, cryptography 48.0.0, idna 3.13 (advisories listed).</w:t>
+        <w:t>pip-audit → python-multipart 0.0.20, requests 2.32.5, urllib3 2.6.3, starlette 0.49.3, click 8.1.8, python-dotenv 1.2.1 — each is the newest release that still supports Python 3.9; the advisory fixes require Python ≥ 3.10.</w:t>
       </w:r>
     </w:p>
     <w:tbl>
@@ -3684,7 +3684,7 @@
                 <w:b w:val="0"/>
                 <w:sz w:val="18"/>
               </w:rPr>
-              <w:t>Upgraded cryptography→49.0.0 and idna→3.18 on the live venv (both fix their CVEs). Bumped minimum versions in setup.py. The patched python-multipart/requests/urllib3/python-dotenv releases require Python ≥ 3.10, so python_requires was raised to 3.10 (the project already targets 3.10–3.12).</w:t>
+              <w:t>Security-patched minimum versions are pinned in pyproject.toml and requirements.txt (requests ≥2.32.4, urllib3 ≥2.6.0, python-multipart ≥0.0.18, cryptography ≥44.0.1). On Python 3.10+ those floors resolve to the fully-patched releases with no code change. On Python 3.9 — which the project still supports — each package is already installed at the newest 3.9-compatible release; the residual advisories are only fixed in versions that require Python ≥ 3.10 (Python 3.9 reached end-of-life in October 2025).</w:t>
             </w:r>
           </w:p>
         </w:tc>
@@ -3724,7 +3724,7 @@
                 <w:color w:val="15803D"/>
                 <w:sz w:val="18"/>
               </w:rPr>
-              <w:t>PARTIAL — cryptography/idna patched live; remainder patched on install for Python 3.10+. Mitigated meanwhile by the F-02 streaming upload (reduces python-multipart exposure).</w:t>
+              <w:t>MITIGATED — fully patched on Python 3.10+; on 3.9 pinned to the newest compatible release. Primary recommendation: run PacketIQ on Python 3.10+ to pick up every fix automatically (see §6).</w:t>
             </w:r>
           </w:p>
         </w:tc>
@@ -6284,7 +6284,7 @@
                 <w:b w:val="0"/>
                 <w:sz w:val="18"/>
               </w:rPr>
-              <w:t>150 passed (143 before + 7 new security regression tests) — no regressions.</w:t>
+              <w:t>304 passed — the full suite, including the security regression tests added in this engagement — no regressions.</w:t>
             </w:r>
           </w:p>
         </w:tc>
@@ -6362,7 +6362,7 @@
                 <w:b w:val="0"/>
                 <w:sz w:val="18"/>
               </w:rPr>
-              <w:t>High: 1 → 0 and Medium → 0. Remaining Low findings are defensive try/except/pass.</w:t>
+              <w:t>High: 0, Medium: 0, Low: 53. Remaining Low findings are defensive try/except/pass and list-form subprocess calls (no shell=True). The pseudo-random calls in the synthetic capture/benchmark generators are annotated "# nosec B311" (deterministic sample data, never cryptographic).</w:t>
             </w:r>
           </w:p>
         </w:tc>
@@ -6440,7 +6440,7 @@
                 <w:b w:val="0"/>
                 <w:sz w:val="18"/>
               </w:rPr>
-              <w:t>cryptography and idna advisories cleared; remainder patched for Python &gt;= 3.10 (setup.py + python_requires updated).</w:t>
+              <w:t>On Python 3.10+ the pinned floors resolve to fully-patched releases. On Python 3.9 every flagged package is at its newest 3.9-compatible version; the residual fixes require Python &gt;= 3.10 (3.9 is end-of-life).</w:t>
             </w:r>
           </w:p>
         </w:tc>
@@ -6451,7 +6451,7 @@
         <w:pStyle w:val="Heading2"/>
       </w:pPr>
       <w:r>
-        <w:t>Required owner action (F-01 — cannot be done from code)</w:t>
+        <w:t>Owner action (F-01) — completed</w:t>
       </w:r>
     </w:p>
     <w:p>
@@ -6459,15 +6459,7 @@
         <w:rPr>
           <w:sz w:val="20"/>
         </w:rPr>
-        <w:t>1. Revoke the exposed keys in the provider consoles (Google AI Studio &amp; Groq) and issue new ones.</w:t>
-      </w:r>
-    </w:p>
-    <w:p>
-      <w:r>
-        <w:rPr>
-          <w:sz w:val="20"/>
-        </w:rPr>
-        <w:t>2. Purge them from git history, then force-push:</w:t>
+        <w:t>The account owner revoked both exposed keys in the provider consoles (Google AI Studio &amp; Groq) on 2026-07-12, so the leaked values no longer authenticate. Optionally, scrub them from git history before any public push so the dead values do not linger in the record:</w:t>
       </w:r>
     </w:p>
     <w:p>
@@ -6500,7 +6492,7 @@
     </w:p>
     <w:p>
       <w:r>
-        <w:t>At the code level PacketIQ is a well-built and defensible application: it avoids the common high-impact web vulnerabilities and now streams uploads, bounds its buffers, validates Host/Origin headers, blocks path traversal, hardens its one privileged path, and restricts its data directories. After this engagement there are no outstanding code-level vulnerabilities — including a real path-traversal and CSRF/DNS-rebinding class closed in round two. The only residual risk is operational: the API keys committed to git history must be rotated and scrubbed by the owner. Hardening beyond that scope (authentication, rate-limiting) is recommended only if the web app is ever exposed beyond localhost.</w:t>
+        <w:t>At the code level PacketIQ is a well-built and defensible application: it avoids the common high-impact web vulnerabilities and now streams uploads, bounds its buffers, validates Host/Origin headers, blocks path traversal, hardens its one privileged path, and restricts its data directories. After this engagement there are no outstanding code-level vulnerabilities, including a real path-traversal and CSRF/DNS-rebinding class closed in round two. The one operational risk, API keys committed to git history, has been closed by the owner revoking those keys. The main forward-looking recommendation is to run on Python 3.10+ so the pinned dependency floors resolve to fully-patched releases; further hardening (authentication, rate-limiting) is worthwhile only if the web app is ever exposed beyond localhost.</w:t>
       </w:r>
     </w:p>
     <w:sectPr>

</xml_diff>

<commit_message>
Update security audit documentation for Python 3.12.13 migration
- Revised findings in make_security_docx.py and make_security_pdf.py to reflect the migration of the reference environment to Python 3.12.13, highlighting the resolution of runtime dependency advisories and the status of known vulnerabilities.
- Updated pip_audit.txt to document the changes in the environment and the resolved versions of dependencies, including a note on a remaining dev-only advisory.
</commit_message>
<xml_diff>
--- a/docs/reports/PacketIQ_Security_Audit_Report.docx
+++ b/docs/reports/PacketIQ_Security_Audit_Report.docx
@@ -431,7 +431,7 @@
                 <w:b w:val="0"/>
                 <w:sz w:val="18"/>
               </w:rPr>
-              <w:t>Sandboxed local venv · Python 3.9.6 · Darwin</w:t>
+              <w:t>Sandboxed local venv · Python 3.12.13 · Darwin</w:t>
             </w:r>
           </w:p>
         </w:tc>
@@ -470,7 +470,7 @@
                 <w:b w:val="0"/>
                 <w:sz w:val="18"/>
               </w:rPr>
-              <w:t>2026-07-15 11:36 UTC</w:t>
+              <w:t>2026-07-15 12:18 UTC</w:t>
             </w:r>
           </w:p>
         </w:tc>
@@ -942,7 +942,7 @@
                 <w:b w:val="0"/>
                 <w:sz w:val="16"/>
               </w:rPr>
-              <w:t>MITIGATED</w:t>
+              <w:t>RESOLVED on the reference environment</w:t>
             </w:r>
           </w:p>
         </w:tc>
@@ -2485,7 +2485,7 @@
                 <w:b w:val="0"/>
                 <w:sz w:val="16"/>
               </w:rPr>
-              <w:t>cryptography/idna cleared; rest resolve to patched on Python ≥3.10</w:t>
+              <w:t>reference env migrated to Python 3.12.13 — runtime advisories cleared; 3.9 stays supported at newest-compatible pins</w:t>
             </w:r>
           </w:p>
         </w:tc>
@@ -3637,7 +3637,7 @@
           <w:rFonts w:ascii="Consolas" w:hAnsi="Consolas"/>
           <w:sz w:val="16"/>
         </w:rPr>
-        <w:t>pip-audit → python-multipart 0.0.20, requests 2.32.5, urllib3 2.6.3, starlette 0.49.3, click 8.1.8, python-dotenv 1.2.1 — each is the newest release that still supports Python 3.9; the advisory fixes require Python ≥ 3.10.</w:t>
+        <w:t>The reference environment was migrated to Python 3.12.13 (2026-07-15), where pip resolves the pinned floors to their fully-patched releases: python-multipart 0.0.20→0.0.32, requests 2.32.5→2.34.2, urllib3 2.6.3→2.7.0, starlette 0.49.3→1.3.1, click 8.1.8→8.4.2, python-dotenv 1.2.1→1.2.2. pip-audit on that venv reports zero advisories across the runtime dependency set. On Python 3.9 each package is instead pinned to the newest 3.9-compatible release, and the advisory fixes require Python ≥ 3.10.</w:t>
       </w:r>
     </w:p>
     <w:tbl>
@@ -3684,7 +3684,7 @@
                 <w:b w:val="0"/>
                 <w:sz w:val="18"/>
               </w:rPr>
-              <w:t>Security-patched minimum versions are pinned in pyproject.toml and requirements.txt (requests ≥2.32.4, urllib3 ≥2.6.0, python-multipart ≥0.0.18, cryptography ≥44.0.1). On Python 3.10+ those floors resolve to the fully-patched releases with no code change. On Python 3.9 — which the project still supports — each package is already installed at the newest 3.9-compatible release; the residual advisories are only fixed in versions that require Python ≥ 3.10 (Python 3.9 reached end-of-life in October 2025).</w:t>
+              <w:t>Security-patched minimum versions are pinned in pyproject.toml and requirements.txt (requests ≥2.32.4, urllib3 ≥2.6.0, python-multipart ≥0.0.18, cryptography ≥44.0.1). The reference/dev environment was migrated to Python 3.12.13 (2026-07-15) using a standalone uv-managed interpreter — no system change and no code change (requires-python stays ≥3.9) — and there the floors resolve to fully-patched releases. Python 3.9 remains supported for anyone who needs it, installing at the newest 3.9-compatible release (Python 3.9 reached end-of-life in October 2025).</w:t>
             </w:r>
           </w:p>
         </w:tc>
@@ -3724,7 +3724,7 @@
                 <w:color w:val="15803D"/>
                 <w:sz w:val="18"/>
               </w:rPr>
-              <w:t>MITIGATED — fully patched on Python 3.10+; on 3.9 pinned to the newest compatible release. Primary recommendation: run PacketIQ on Python 3.10+ to pick up every fix automatically (see §6).</w:t>
+              <w:t>RESOLVED on the reference environment (Python 3.12.13) — the runtime-dependency advisories (python-multipart, starlette, requests, urllib3, click, python-dotenv) are cleared. Python 3.9 stays supported with newest-compatible pins. One dev-only transitive advisory remains: diskcache (pulled by the dev-extra pySigma, not a runtime dependency) — PYSEC-2026-2447, no upstream fix released yet; never shipped to runtime users.</w:t>
             </w:r>
           </w:p>
         </w:tc>
@@ -6440,7 +6440,7 @@
                 <w:b w:val="0"/>
                 <w:sz w:val="18"/>
               </w:rPr>
-              <w:t>On Python 3.10+ the pinned floors resolve to fully-patched releases. On Python 3.9 every flagged package is at its newest 3.9-compatible version; the residual fixes require Python &gt;= 3.10 (3.9 is end-of-life).</w:t>
+              <w:t>Reference environment migrated to Python 3.12.13: the pinned floors resolve to fully-patched releases and the runtime dependency set reports zero advisories. One dev-only transitive remains (diskcache via the dev-extra pySigma), no upstream fix yet. Python 3.9 stays supported at newest-compatible pins.</w:t>
             </w:r>
           </w:p>
         </w:tc>
@@ -6492,7 +6492,7 @@
     </w:p>
     <w:p>
       <w:r>
-        <w:t>At the code level PacketIQ is a well-built and defensible application: it avoids the common high-impact web vulnerabilities and now streams uploads, bounds its buffers, validates Host/Origin headers, blocks path traversal, hardens its one privileged path, and restricts its data directories. After this engagement there are no outstanding code-level vulnerabilities, including a real path-traversal and CSRF/DNS-rebinding class closed in round two. The one operational risk, API keys committed to git history, has been closed by the owner revoking those keys. The main forward-looking recommendation is to run on Python 3.10+ so the pinned dependency floors resolve to fully-patched releases; further hardening (authentication, rate-limiting) is worthwhile only if the web app is ever exposed beyond localhost.</w:t>
+        <w:t>At the code level PacketIQ is a well-built and defensible application: it avoids the common high-impact web vulnerabilities and now streams uploads, bounds its buffers, validates Host/Origin headers, blocks path traversal, hardens its one privileged path, and restricts its data directories. After this engagement there are no outstanding code-level vulnerabilities, including a real path-traversal and CSRF/DNS-rebinding class closed in round two. The one operational risk, API keys committed to git history, has been closed by the owner revoking those keys. The reference/dev environment has been migrated to Python 3.12.13, so the pinned dependency floors now resolve to fully-patched releases (Python 3.9 stays supported for anyone who needs it); further hardening (authentication, rate-limiting) is worthwhile only if the web app is ever exposed beyond localhost.</w:t>
       </w:r>
     </w:p>
     <w:sectPr>

</xml_diff>